<commit_message>
changed to index.html in joes1
</commit_message>
<xml_diff>
--- a/Joes Hotdog Stand wk 6 Mary Bradley.docx
+++ b/Joes Hotdog Stand wk 6 Mary Bradley.docx
@@ -258,6 +258,89 @@
     </w:p>
     <w:p>
       <w:pPr>
+        <w:keepNext/>
+        <w:keepLines/>
+        <w:numPr>
+          <w:ilvl w:val="0"/>
+          <w:numId w:val="1"/>
+        </w:numPr>
+        <w:spacing w:before="200" w:after="80" w:line="240" w:lineRule="auto"/>
+        <w:outlineLvl w:val="1"/>
+        <w:rPr>
+          <w:rFonts w:ascii="Trebuchet MS" w:eastAsia="Trebuchet MS" w:hAnsi="Trebuchet MS" w:cs="Times New Roman"/>
+          <w:color w:val="404040"/>
+          <w:kern w:val="0"/>
+          <w:sz w:val="22"/>
+          <w:szCs w:val="22"/>
+          <w:lang w:eastAsia="ja-JP"/>
+          <w14:ligatures w14:val="none"/>
+        </w:rPr>
+      </w:pPr>
+      <w:r>
+        <w:rPr>
+          <w:rFonts w:ascii="Trebuchet MS" w:eastAsia="Trebuchet MS" w:hAnsi="Trebuchet MS" w:cs="Times New Roman"/>
+          <w:color w:val="404040"/>
+          <w:kern w:val="0"/>
+          <w:sz w:val="22"/>
+          <w:szCs w:val="22"/>
+          <w:lang w:eastAsia="ja-JP"/>
+          <w14:ligatures w14:val="none"/>
+        </w:rPr>
+        <w:t>https://madagaluna.github.io/SPA-2026/joes1</w:t>
+      </w:r>
+    </w:p>
+    <w:p>
+      <w:pPr>
+        <w:keepNext/>
+        <w:keepLines/>
+        <w:numPr>
+          <w:ilvl w:val="0"/>
+          <w:numId w:val="1"/>
+        </w:numPr>
+        <w:spacing w:before="200" w:after="80" w:line="240" w:lineRule="auto"/>
+        <w:outlineLvl w:val="1"/>
+        <w:rPr>
+          <w:rFonts w:ascii="Trebuchet MS" w:eastAsia="Trebuchet MS" w:hAnsi="Trebuchet MS" w:cs="Times New Roman"/>
+          <w:color w:val="404040"/>
+          <w:kern w:val="0"/>
+          <w:sz w:val="22"/>
+          <w:szCs w:val="22"/>
+          <w:lang w:eastAsia="ja-JP"/>
+          <w14:ligatures w14:val="none"/>
+        </w:rPr>
+      </w:pPr>
+      <w:r>
+        <w:rPr>
+          <w:rFonts w:ascii="Trebuchet MS" w:eastAsia="Trebuchet MS" w:hAnsi="Trebuchet MS" w:cs="Times New Roman"/>
+          <w:color w:val="404040"/>
+          <w:kern w:val="0"/>
+          <w:sz w:val="22"/>
+          <w:szCs w:val="22"/>
+          <w:lang w:eastAsia="ja-JP"/>
+          <w14:ligatures w14:val="none"/>
+        </w:rPr>
+        <w:t>https://madagaluna.github.io/SPA-2026/joes2/</w:t>
+      </w:r>
+    </w:p>
+    <w:p>
+      <w:pPr>
+        <w:keepNext/>
+        <w:keepLines/>
+        <w:spacing w:before="200" w:after="80" w:line="240" w:lineRule="auto"/>
+        <w:outlineLvl w:val="1"/>
+        <w:rPr>
+          <w:rFonts w:ascii="Trebuchet MS" w:eastAsia="Trebuchet MS" w:hAnsi="Trebuchet MS" w:cs="Times New Roman"/>
+          <w:color w:val="404040"/>
+          <w:kern w:val="0"/>
+          <w:sz w:val="22"/>
+          <w:szCs w:val="22"/>
+          <w:lang w:eastAsia="ja-JP"/>
+          <w14:ligatures w14:val="none"/>
+        </w:rPr>
+      </w:pPr>
+    </w:p>
+    <w:p>
+      <w:pPr>
         <w:numPr>
           <w:ilvl w:val="0"/>
           <w:numId w:val="1"/>
@@ -337,6 +420,212 @@
           <w14:ligatures w14:val="none"/>
         </w:rPr>
         <w:t xml:space="preserve"> we have learned in the past few weeks.</w:t>
+      </w:r>
+    </w:p>
+    <w:p>
+      <w:pPr>
+        <w:spacing w:after="120" w:line="240" w:lineRule="auto"/>
+        <w:contextualSpacing/>
+        <w:rPr>
+          <w:rFonts w:ascii="Trebuchet MS" w:eastAsia="Trebuchet MS" w:hAnsi="Trebuchet MS" w:cs="Times New Roman"/>
+          <w:color w:val="404040"/>
+          <w:kern w:val="0"/>
+          <w:sz w:val="22"/>
+          <w:szCs w:val="22"/>
+          <w:lang w:eastAsia="ja-JP"/>
+          <w14:ligatures w14:val="none"/>
+        </w:rPr>
+      </w:pPr>
+      <w:r>
+        <w:rPr>
+          <w:rFonts w:ascii="Trebuchet MS" w:eastAsia="Trebuchet MS" w:hAnsi="Trebuchet MS" w:cs="Times New Roman"/>
+          <w:color w:val="404040"/>
+          <w:kern w:val="0"/>
+          <w:sz w:val="22"/>
+          <w:szCs w:val="22"/>
+          <w:lang w:eastAsia="ja-JP"/>
+          <w14:ligatures w14:val="none"/>
+        </w:rPr>
+        <w:t>A.</w:t>
+      </w:r>
+    </w:p>
+    <w:p>
+      <w:pPr>
+        <w:spacing w:after="120" w:line="240" w:lineRule="auto"/>
+        <w:contextualSpacing/>
+        <w:rPr>
+          <w:rFonts w:ascii="Trebuchet MS" w:eastAsia="Trebuchet MS" w:hAnsi="Trebuchet MS" w:cs="Times New Roman"/>
+          <w:color w:val="404040"/>
+          <w:kern w:val="0"/>
+          <w:sz w:val="22"/>
+          <w:szCs w:val="22"/>
+          <w:lang w:eastAsia="ja-JP"/>
+          <w14:ligatures w14:val="none"/>
+        </w:rPr>
+      </w:pPr>
+      <w:r>
+        <w:rPr>
+          <w:rFonts w:ascii="Trebuchet MS" w:eastAsia="Trebuchet MS" w:hAnsi="Trebuchet MS" w:cs="Times New Roman"/>
+          <w:color w:val="404040"/>
+          <w:kern w:val="0"/>
+          <w:sz w:val="22"/>
+          <w:szCs w:val="22"/>
+          <w:lang w:eastAsia="ja-JP"/>
+          <w14:ligatures w14:val="none"/>
+        </w:rPr>
+        <w:t xml:space="preserve">Using key-value pairs </w:t>
+      </w:r>
+      <w:r>
+        <w:rPr>
+          <w:rFonts w:ascii="Trebuchet MS" w:eastAsia="Trebuchet MS" w:hAnsi="Trebuchet MS" w:cs="Times New Roman"/>
+          <w:color w:val="404040"/>
+          <w:kern w:val="0"/>
+          <w:sz w:val="22"/>
+          <w:szCs w:val="22"/>
+          <w:lang w:eastAsia="ja-JP"/>
+          <w14:ligatures w14:val="none"/>
+        </w:rPr>
+        <w:t xml:space="preserve">lets you store related data together and to access it in multiple ways. Depending on </w:t>
+      </w:r>
+      <w:r>
+        <w:rPr>
+          <w:rFonts w:ascii="Trebuchet MS" w:eastAsia="Trebuchet MS" w:hAnsi="Trebuchet MS" w:cs="Times New Roman"/>
+          <w:color w:val="404040"/>
+          <w:kern w:val="0"/>
+          <w:sz w:val="22"/>
+          <w:szCs w:val="22"/>
+          <w:lang w:eastAsia="ja-JP"/>
+          <w14:ligatures w14:val="none"/>
+        </w:rPr>
+        <w:t>your</w:t>
+      </w:r>
+      <w:r>
+        <w:rPr>
+          <w:rFonts w:ascii="Trebuchet MS" w:eastAsia="Trebuchet MS" w:hAnsi="Trebuchet MS" w:cs="Times New Roman"/>
+          <w:color w:val="404040"/>
+          <w:kern w:val="0"/>
+          <w:sz w:val="22"/>
+          <w:szCs w:val="22"/>
+          <w:lang w:eastAsia="ja-JP"/>
+          <w14:ligatures w14:val="none"/>
+        </w:rPr>
+        <w:t xml:space="preserve"> </w:t>
+      </w:r>
+      <w:r>
+        <w:rPr>
+          <w:rFonts w:ascii="Trebuchet MS" w:eastAsia="Trebuchet MS" w:hAnsi="Trebuchet MS" w:cs="Times New Roman"/>
+          <w:color w:val="404040"/>
+          <w:kern w:val="0"/>
+          <w:sz w:val="22"/>
+          <w:szCs w:val="22"/>
+          <w:lang w:eastAsia="ja-JP"/>
+          <w14:ligatures w14:val="none"/>
+        </w:rPr>
+        <w:t>use-</w:t>
+      </w:r>
+      <w:r>
+        <w:rPr>
+          <w:rFonts w:ascii="Trebuchet MS" w:eastAsia="Trebuchet MS" w:hAnsi="Trebuchet MS" w:cs="Times New Roman"/>
+          <w:color w:val="404040"/>
+          <w:kern w:val="0"/>
+          <w:sz w:val="22"/>
+          <w:szCs w:val="22"/>
+          <w:lang w:eastAsia="ja-JP"/>
+          <w14:ligatures w14:val="none"/>
+        </w:rPr>
+        <w:t>case, it can be processed as an object or converted to strings or arrays to take advantage of methods that work with those types.  This makes it possible to manipulate and reuse the same data throughout one program.</w:t>
+      </w:r>
+    </w:p>
+    <w:p>
+      <w:pPr>
+        <w:spacing w:after="120" w:line="240" w:lineRule="auto"/>
+        <w:contextualSpacing/>
+        <w:rPr>
+          <w:rFonts w:ascii="Trebuchet MS" w:eastAsia="Trebuchet MS" w:hAnsi="Trebuchet MS" w:cs="Times New Roman"/>
+          <w:color w:val="404040"/>
+          <w:kern w:val="0"/>
+          <w:sz w:val="22"/>
+          <w:szCs w:val="22"/>
+          <w:lang w:eastAsia="ja-JP"/>
+          <w14:ligatures w14:val="none"/>
+        </w:rPr>
+      </w:pPr>
+      <w:r>
+        <w:rPr>
+          <w:rFonts w:ascii="Trebuchet MS" w:eastAsia="Trebuchet MS" w:hAnsi="Trebuchet MS" w:cs="Times New Roman"/>
+          <w:color w:val="404040"/>
+          <w:kern w:val="0"/>
+          <w:sz w:val="22"/>
+          <w:szCs w:val="22"/>
+          <w:lang w:eastAsia="ja-JP"/>
+          <w14:ligatures w14:val="none"/>
+        </w:rPr>
+        <w:t>B.</w:t>
+      </w:r>
+    </w:p>
+    <w:p>
+      <w:pPr>
+        <w:spacing w:after="120" w:line="240" w:lineRule="auto"/>
+        <w:contextualSpacing/>
+        <w:rPr>
+          <w:rFonts w:ascii="Trebuchet MS" w:eastAsia="Trebuchet MS" w:hAnsi="Trebuchet MS" w:cs="Times New Roman"/>
+          <w:color w:val="404040"/>
+          <w:kern w:val="0"/>
+          <w:sz w:val="22"/>
+          <w:szCs w:val="22"/>
+          <w:lang w:eastAsia="ja-JP"/>
+          <w14:ligatures w14:val="none"/>
+        </w:rPr>
+      </w:pPr>
+      <w:r>
+        <w:rPr>
+          <w:rFonts w:ascii="Trebuchet MS" w:eastAsia="Trebuchet MS" w:hAnsi="Trebuchet MS" w:cs="Times New Roman"/>
+          <w:color w:val="404040"/>
+          <w:kern w:val="0"/>
+          <w:sz w:val="22"/>
+          <w:szCs w:val="22"/>
+          <w:lang w:eastAsia="ja-JP"/>
+          <w14:ligatures w14:val="none"/>
+        </w:rPr>
+        <w:t xml:space="preserve">Stringify and parse are a little less mystifying this time </w:t>
+      </w:r>
+      <w:proofErr w:type="gramStart"/>
+      <w:r>
+        <w:rPr>
+          <w:rFonts w:ascii="Trebuchet MS" w:eastAsia="Trebuchet MS" w:hAnsi="Trebuchet MS" w:cs="Times New Roman"/>
+          <w:color w:val="404040"/>
+          <w:kern w:val="0"/>
+          <w:sz w:val="22"/>
+          <w:szCs w:val="22"/>
+          <w:lang w:eastAsia="ja-JP"/>
+          <w14:ligatures w14:val="none"/>
+        </w:rPr>
+        <w:t>around</w:t>
+      </w:r>
+      <w:proofErr w:type="gramEnd"/>
+      <w:r>
+        <w:rPr>
+          <w:rFonts w:ascii="Trebuchet MS" w:eastAsia="Trebuchet MS" w:hAnsi="Trebuchet MS" w:cs="Times New Roman"/>
+          <w:color w:val="404040"/>
+          <w:kern w:val="0"/>
+          <w:sz w:val="22"/>
+          <w:szCs w:val="22"/>
+          <w:lang w:eastAsia="ja-JP"/>
+          <w14:ligatures w14:val="none"/>
+        </w:rPr>
+        <w:t xml:space="preserve"> but I </w:t>
+      </w:r>
+      <w:r>
+        <w:rPr>
+          <w:rFonts w:ascii="Trebuchet MS" w:eastAsia="Trebuchet MS" w:hAnsi="Trebuchet MS" w:cs="Times New Roman"/>
+          <w:color w:val="404040"/>
+          <w:kern w:val="0"/>
+          <w:sz w:val="22"/>
+          <w:szCs w:val="22"/>
+          <w:lang w:eastAsia="ja-JP"/>
+          <w14:ligatures w14:val="none"/>
+        </w:rPr>
+        <w:t>think I like map() the best because it gives you a new array without modifying the original.  I'll come to trust the other methods someday, I'm sure.</w:t>
       </w:r>
     </w:p>
     <w:p>
@@ -1224,7 +1513,6 @@
   <w:style w:type="character" w:default="1" w:styleId="DefaultParagraphFont">
     <w:name w:val="Default Paragraph Font"/>
     <w:uiPriority w:val="1"/>
-    <w:semiHidden/>
     <w:unhideWhenUsed/>
   </w:style>
   <w:style w:type="table" w:default="1" w:styleId="TableNormal">
@@ -1561,6 +1849,29 @@
     <w:uiPriority w:val="99"/>
     <w:semiHidden/>
     <w:rsid w:val="00373A99"/>
+  </w:style>
+  <w:style w:type="character" w:styleId="Hyperlink">
+    <w:name w:val="Hyperlink"/>
+    <w:basedOn w:val="DefaultParagraphFont"/>
+    <w:uiPriority w:val="99"/>
+    <w:unhideWhenUsed/>
+    <w:rsid w:val="00885225"/>
+    <w:rPr>
+      <w:color w:val="0563C1" w:themeColor="hyperlink"/>
+      <w:u w:val="single"/>
+    </w:rPr>
+  </w:style>
+  <w:style w:type="character" w:styleId="UnresolvedMention">
+    <w:name w:val="Unresolved Mention"/>
+    <w:basedOn w:val="DefaultParagraphFont"/>
+    <w:uiPriority w:val="99"/>
+    <w:semiHidden/>
+    <w:unhideWhenUsed/>
+    <w:rsid w:val="00885225"/>
+    <w:rPr>
+      <w:color w:val="605E5C"/>
+      <w:shd w:val="clear" w:color="auto" w:fill="E1DFDD"/>
+    </w:rPr>
   </w:style>
 </w:styles>
 </file>

</xml_diff>

<commit_message>
works for one duplicate but not two
</commit_message>
<xml_diff>
--- a/Joes Hotdog Stand wk 6 Mary Bradley.docx
+++ b/Joes Hotdog Stand wk 6 Mary Bradley.docx
@@ -767,9 +767,79 @@
         </w:rPr>
       </w:pPr>
     </w:p>
+    <w:p>
+      <w:r>
+        <w:t xml:space="preserve">1. deciding what I think before asking everyone else what they think </w:t>
+      </w:r>
+    </w:p>
+    <w:p>
+      <w:r>
+        <w:t>2. saying “let me get back to you” instead of answering on the spot</w:t>
+      </w:r>
+    </w:p>
+    <w:p>
+      <w:r>
+        <w:t xml:space="preserve"> 3. not explaining every “no” </w:t>
+      </w:r>
+    </w:p>
+    <w:p>
+      <w:r>
+        <w:t>4. leaving 10 minutes earlier than I need to</w:t>
+      </w:r>
+    </w:p>
+    <w:p>
+      <w:r>
+        <w:t xml:space="preserve"> 5. keeping some good news to myself until it’s real </w:t>
+      </w:r>
+    </w:p>
+    <w:p>
+      <w:r>
+        <w:t xml:space="preserve">6. not checking my phone the second I wake up </w:t>
+      </w:r>
+    </w:p>
+    <w:p>
+      <w:r>
+        <w:t>7. doing the small thing right away if it takes 2 minutes</w:t>
+      </w:r>
+    </w:p>
+    <w:p>
+      <w:r>
+        <w:lastRenderedPageBreak/>
+        <w:t xml:space="preserve"> 8. setting the table and pouring water into a real glass </w:t>
+      </w:r>
+    </w:p>
+    <w:p>
+      <w:r>
+        <w:t xml:space="preserve">9. buying fewer things, but wearing them more </w:t>
+      </w:r>
+    </w:p>
+    <w:p>
+      <w:r>
+        <w:t xml:space="preserve">10. choosing </w:t>
+      </w:r>
+      <w:proofErr w:type="gramStart"/>
+      <w:r>
+        <w:t>sleep</w:t>
+      </w:r>
+      <w:proofErr w:type="gramEnd"/>
+      <w:r>
+        <w:t xml:space="preserve"> over one more scroll</w:t>
+      </w:r>
+    </w:p>
+    <w:p>
+      <w:r>
+        <w:t xml:space="preserve">11. drinking water before coffee </w:t>
+      </w:r>
+    </w:p>
+    <w:p>
+      <w:r>
+        <w:t>12. not apologizing for taking up space in a room</w:t>
+      </w:r>
+    </w:p>
+    <w:p/>
     <w:p/>
     <w:sectPr>
-      <w:footerReference w:type="default" r:id="rId5"/>
+      <w:footerReference w:type="default" r:id="rId7"/>
       <w:pgSz w:w="12240" w:h="15840" w:code="1"/>
       <w:pgMar w:top="864" w:right="1008" w:bottom="1152" w:left="1008" w:header="720" w:footer="864" w:gutter="0"/>
       <w:cols w:space="720"/>
@@ -777,6 +847,31 @@
     </w:sectPr>
   </w:body>
 </w:document>
+</file>
+
+<file path=word/endnotes.xml><?xml version="1.0" encoding="utf-8"?>
+<w:endnotes xmlns:wpc="http://schemas.microsoft.com/office/word/2010/wordprocessingCanvas" xmlns:cx="http://schemas.microsoft.com/office/drawing/2014/chartex" xmlns:cx1="http://schemas.microsoft.com/office/drawing/2015/9/8/chartex" xmlns:cx2="http://schemas.microsoft.com/office/drawing/2015/10/21/chartex" xmlns:cx3="http://schemas.microsoft.com/office/drawing/2016/5/9/chartex" xmlns:cx4="http://schemas.microsoft.com/office/drawing/2016/5/10/chartex" xmlns:cx5="http://schemas.microsoft.com/office/drawing/2016/5/11/chartex" xmlns:cx6="http://schemas.microsoft.com/office/drawing/2016/5/12/chartex" xmlns:cx7="http://schemas.microsoft.com/office/drawing/2016/5/13/chartex" xmlns:cx8="http://schemas.microsoft.com/office/drawing/2016/5/14/chartex" xmlns:mc="http://schemas.openxmlformats.org/markup-compatibility/2006" xmlns:aink="http://schemas.microsoft.com/office/drawing/2016/ink" xmlns:am3d="http://schemas.microsoft.com/office/drawing/2017/model3d" xmlns:o="urn:schemas-microsoft-com:office:office" xmlns:oel="http://schemas.microsoft.com/office/2019/extlst" xmlns:r="http://schemas.openxmlformats.org/officeDocument/2006/relationships" xmlns:m="http://schemas.openxmlformats.org/officeDocument/2006/math" xmlns:v="urn:schemas-microsoft-com:vml" xmlns:wp14="http://schemas.microsoft.com/office/word/2010/wordprocessingDrawing" xmlns:wp="http://schemas.openxmlformats.org/drawingml/2006/wordprocessingDrawing" xmlns:w10="urn:schemas-microsoft-com:office:word" xmlns:w="http://schemas.openxmlformats.org/wordprocessingml/2006/main" xmlns:w14="http://schemas.microsoft.com/office/word/2010/wordml" xmlns:w15="http://schemas.microsoft.com/office/word/2012/wordml" xmlns:w16cex="http://schemas.microsoft.com/office/word/2018/wordml/cex" xmlns:w16cid="http://schemas.microsoft.com/office/word/2016/wordml/cid" xmlns:w16="http://schemas.microsoft.com/office/word/2018/wordml" xmlns:w16du="http://schemas.microsoft.com/office/word/2023/wordml/word16du" xmlns:w16sdtdh="http://schemas.microsoft.com/office/word/2020/wordml/sdtdatahash" xmlns:w16sdtfl="http://schemas.microsoft.com/office/word/2024/wordml/sdtformatlock" xmlns:w16se="http://schemas.microsoft.com/office/word/2015/wordml/symex" xmlns:wpg="http://schemas.microsoft.com/office/word/2010/wordprocessingGroup" xmlns:wpi="http://schemas.microsoft.com/office/word/2010/wordprocessingInk" xmlns:wne="http://schemas.microsoft.com/office/word/2006/wordml" xmlns:wps="http://schemas.microsoft.com/office/word/2010/wordprocessingShape" mc:Ignorable="w14 w15 w16se w16cid w16 w16cex w16sdtdh w16sdtfl w16du wp14">
+  <w:endnote w:type="separator" w:id="-1">
+    <w:p>
+      <w:pPr>
+        <w:spacing w:after="0" w:line="240" w:lineRule="auto"/>
+      </w:pPr>
+      <w:r>
+        <w:separator/>
+      </w:r>
+    </w:p>
+  </w:endnote>
+  <w:endnote w:type="continuationSeparator" w:id="0">
+    <w:p>
+      <w:pPr>
+        <w:spacing w:after="0" w:line="240" w:lineRule="auto"/>
+      </w:pPr>
+      <w:r>
+        <w:continuationSeparator/>
+      </w:r>
+    </w:p>
+  </w:endnote>
+</w:endnotes>
 </file>
 
 <file path=word/footer1.xml><?xml version="1.0" encoding="utf-8"?>
@@ -787,6 +882,31 @@
     </w:pPr>
   </w:p>
 </w:ftr>
+</file>
+
+<file path=word/footnotes.xml><?xml version="1.0" encoding="utf-8"?>
+<w:footnotes xmlns:wpc="http://schemas.microsoft.com/office/word/2010/wordprocessingCanvas" xmlns:cx="http://schemas.microsoft.com/office/drawing/2014/chartex" xmlns:cx1="http://schemas.microsoft.com/office/drawing/2015/9/8/chartex" xmlns:cx2="http://schemas.microsoft.com/office/drawing/2015/10/21/chartex" xmlns:cx3="http://schemas.microsoft.com/office/drawing/2016/5/9/chartex" xmlns:cx4="http://schemas.microsoft.com/office/drawing/2016/5/10/chartex" xmlns:cx5="http://schemas.microsoft.com/office/drawing/2016/5/11/chartex" xmlns:cx6="http://schemas.microsoft.com/office/drawing/2016/5/12/chartex" xmlns:cx7="http://schemas.microsoft.com/office/drawing/2016/5/13/chartex" xmlns:cx8="http://schemas.microsoft.com/office/drawing/2016/5/14/chartex" xmlns:mc="http://schemas.openxmlformats.org/markup-compatibility/2006" xmlns:aink="http://schemas.microsoft.com/office/drawing/2016/ink" xmlns:am3d="http://schemas.microsoft.com/office/drawing/2017/model3d" xmlns:o="urn:schemas-microsoft-com:office:office" xmlns:oel="http://schemas.microsoft.com/office/2019/extlst" xmlns:r="http://schemas.openxmlformats.org/officeDocument/2006/relationships" xmlns:m="http://schemas.openxmlformats.org/officeDocument/2006/math" xmlns:v="urn:schemas-microsoft-com:vml" xmlns:wp14="http://schemas.microsoft.com/office/word/2010/wordprocessingDrawing" xmlns:wp="http://schemas.openxmlformats.org/drawingml/2006/wordprocessingDrawing" xmlns:w10="urn:schemas-microsoft-com:office:word" xmlns:w="http://schemas.openxmlformats.org/wordprocessingml/2006/main" xmlns:w14="http://schemas.microsoft.com/office/word/2010/wordml" xmlns:w15="http://schemas.microsoft.com/office/word/2012/wordml" xmlns:w16cex="http://schemas.microsoft.com/office/word/2018/wordml/cex" xmlns:w16cid="http://schemas.microsoft.com/office/word/2016/wordml/cid" xmlns:w16="http://schemas.microsoft.com/office/word/2018/wordml" xmlns:w16du="http://schemas.microsoft.com/office/word/2023/wordml/word16du" xmlns:w16sdtdh="http://schemas.microsoft.com/office/word/2020/wordml/sdtdatahash" xmlns:w16sdtfl="http://schemas.microsoft.com/office/word/2024/wordml/sdtformatlock" xmlns:w16se="http://schemas.microsoft.com/office/word/2015/wordml/symex" xmlns:wpg="http://schemas.microsoft.com/office/word/2010/wordprocessingGroup" xmlns:wpi="http://schemas.microsoft.com/office/word/2010/wordprocessingInk" xmlns:wne="http://schemas.microsoft.com/office/word/2006/wordml" xmlns:wps="http://schemas.microsoft.com/office/word/2010/wordprocessingShape" mc:Ignorable="w14 w15 w16se w16cid w16 w16cex w16sdtdh w16sdtfl w16du wp14">
+  <w:footnote w:type="separator" w:id="-1">
+    <w:p>
+      <w:pPr>
+        <w:spacing w:after="0" w:line="240" w:lineRule="auto"/>
+      </w:pPr>
+      <w:r>
+        <w:separator/>
+      </w:r>
+    </w:p>
+  </w:footnote>
+  <w:footnote w:type="continuationSeparator" w:id="0">
+    <w:p>
+      <w:pPr>
+        <w:spacing w:after="0" w:line="240" w:lineRule="auto"/>
+      </w:pPr>
+      <w:r>
+        <w:continuationSeparator/>
+      </w:r>
+    </w:p>
+  </w:footnote>
+</w:footnotes>
 </file>
 
 <file path=word/numbering.xml><?xml version="1.0" encoding="utf-8"?>

</xml_diff>